<commit_message>
modificacion plantilla y modificacion path de python
</commit_message>
<xml_diff>
--- a/src/main/resources/templates/docgen/4.1/4.1.-CONTRATO DE PRESTACIÓN DE SERVICIOS (MORAL).docx
+++ b/src/main/resources/templates/docgen/4.1/4.1.-CONTRATO DE PRESTACIÓN DE SERVICIOS (MORAL).docx
@@ -1154,7 +1154,27 @@
           <w:szCs w:val="21"/>
           <w:lang w:val="es-MX"/>
         </w:rPr>
-        <w:t>{{CIUDAD ASAMBLEA}}</w:t>
+        <w:t>{{CIUDAD</w:t>
+      </w:r>
+      <w:r>
+        <w:rPr>
+          <w:rFonts w:ascii="Avenir Book" w:hAnsi="Avenir Book"/>
+          <w:color w:val="FF0000"/>
+          <w:sz w:val="21"/>
+          <w:szCs w:val="21"/>
+          <w:lang w:val="es-MX"/>
+        </w:rPr>
+        <w:t>_</w:t>
+      </w:r>
+      <w:r>
+        <w:rPr>
+          <w:rFonts w:ascii="Avenir Book" w:hAnsi="Avenir Book"/>
+          <w:color w:val="FF0000"/>
+          <w:sz w:val="21"/>
+          <w:szCs w:val="21"/>
+          <w:lang w:val="es-MX"/>
+        </w:rPr>
+        <w:t>ASAMBLEA}}</w:t>
       </w:r>
       <w:r>
         <w:rPr>
@@ -4484,7 +4504,7 @@
           <w:szCs w:val="21"/>
           <w:lang w:val="es-MX"/>
         </w:rPr>
-        <w:t>DIA INICIO VIGENCIA</w:t>
+        <w:t>DIA</w:t>
       </w:r>
       <w:r>
         <w:rPr>
@@ -4494,6 +4514,46 @@
           <w:szCs w:val="21"/>
           <w:lang w:val="es-MX"/>
         </w:rPr>
+        <w:t>_</w:t>
+      </w:r>
+      <w:r>
+        <w:rPr>
+          <w:rFonts w:ascii="Avenir Book" w:hAnsi="Avenir Book"/>
+          <w:color w:val="FF0000"/>
+          <w:sz w:val="21"/>
+          <w:szCs w:val="21"/>
+          <w:lang w:val="es-MX"/>
+        </w:rPr>
+        <w:t>INICIO</w:t>
+      </w:r>
+      <w:r>
+        <w:rPr>
+          <w:rFonts w:ascii="Avenir Book" w:hAnsi="Avenir Book"/>
+          <w:color w:val="FF0000"/>
+          <w:sz w:val="21"/>
+          <w:szCs w:val="21"/>
+          <w:lang w:val="es-MX"/>
+        </w:rPr>
+        <w:t>_</w:t>
+      </w:r>
+      <w:r>
+        <w:rPr>
+          <w:rFonts w:ascii="Avenir Book" w:hAnsi="Avenir Book"/>
+          <w:color w:val="FF0000"/>
+          <w:sz w:val="21"/>
+          <w:szCs w:val="21"/>
+          <w:lang w:val="es-MX"/>
+        </w:rPr>
+        <w:t>VIGENCIA</w:t>
+      </w:r>
+      <w:r>
+        <w:rPr>
+          <w:rFonts w:ascii="Avenir Book" w:hAnsi="Avenir Book"/>
+          <w:color w:val="FF0000"/>
+          <w:sz w:val="21"/>
+          <w:szCs w:val="21"/>
+          <w:lang w:val="es-MX"/>
+        </w:rPr>
         <w:t>}}</w:t>
       </w:r>
       <w:r>
@@ -4533,7 +4593,7 @@
           <w:szCs w:val="21"/>
           <w:lang w:val="es-MX"/>
         </w:rPr>
-        <w:t>MES INICIO VIGENCIA</w:t>
+        <w:t>MES</w:t>
       </w:r>
       <w:r>
         <w:rPr>
@@ -4543,6 +4603,46 @@
           <w:szCs w:val="21"/>
           <w:lang w:val="es-MX"/>
         </w:rPr>
+        <w:t>_</w:t>
+      </w:r>
+      <w:r>
+        <w:rPr>
+          <w:rFonts w:ascii="Avenir Book" w:hAnsi="Avenir Book"/>
+          <w:color w:val="FF0000"/>
+          <w:sz w:val="21"/>
+          <w:szCs w:val="21"/>
+          <w:lang w:val="es-MX"/>
+        </w:rPr>
+        <w:t>INICIO</w:t>
+      </w:r>
+      <w:r>
+        <w:rPr>
+          <w:rFonts w:ascii="Avenir Book" w:hAnsi="Avenir Book"/>
+          <w:color w:val="FF0000"/>
+          <w:sz w:val="21"/>
+          <w:szCs w:val="21"/>
+          <w:lang w:val="es-MX"/>
+        </w:rPr>
+        <w:t>_</w:t>
+      </w:r>
+      <w:r>
+        <w:rPr>
+          <w:rFonts w:ascii="Avenir Book" w:hAnsi="Avenir Book"/>
+          <w:color w:val="FF0000"/>
+          <w:sz w:val="21"/>
+          <w:szCs w:val="21"/>
+          <w:lang w:val="es-MX"/>
+        </w:rPr>
+        <w:t>VIGENCIA</w:t>
+      </w:r>
+      <w:r>
+        <w:rPr>
+          <w:rFonts w:ascii="Avenir Book" w:hAnsi="Avenir Book"/>
+          <w:color w:val="FF0000"/>
+          <w:sz w:val="21"/>
+          <w:szCs w:val="21"/>
+          <w:lang w:val="es-MX"/>
+        </w:rPr>
         <w:t>}}</w:t>
       </w:r>
       <w:r>
@@ -4582,7 +4682,7 @@
           <w:szCs w:val="21"/>
           <w:lang w:val="es-MX"/>
         </w:rPr>
-        <w:t>AÑO INICIO VIGENCIA</w:t>
+        <w:t>AÑO</w:t>
       </w:r>
       <w:r>
         <w:rPr>
@@ -4592,6 +4692,46 @@
           <w:szCs w:val="21"/>
           <w:lang w:val="es-MX"/>
         </w:rPr>
+        <w:t>_</w:t>
+      </w:r>
+      <w:r>
+        <w:rPr>
+          <w:rFonts w:ascii="Avenir Book" w:hAnsi="Avenir Book"/>
+          <w:color w:val="FF0000"/>
+          <w:sz w:val="21"/>
+          <w:szCs w:val="21"/>
+          <w:lang w:val="es-MX"/>
+        </w:rPr>
+        <w:t>INICIO</w:t>
+      </w:r>
+      <w:r>
+        <w:rPr>
+          <w:rFonts w:ascii="Avenir Book" w:hAnsi="Avenir Book"/>
+          <w:color w:val="FF0000"/>
+          <w:sz w:val="21"/>
+          <w:szCs w:val="21"/>
+          <w:lang w:val="es-MX"/>
+        </w:rPr>
+        <w:t>_</w:t>
+      </w:r>
+      <w:r>
+        <w:rPr>
+          <w:rFonts w:ascii="Avenir Book" w:hAnsi="Avenir Book"/>
+          <w:color w:val="FF0000"/>
+          <w:sz w:val="21"/>
+          <w:szCs w:val="21"/>
+          <w:lang w:val="es-MX"/>
+        </w:rPr>
+        <w:t>VIGENCIA</w:t>
+      </w:r>
+      <w:r>
+        <w:rPr>
+          <w:rFonts w:ascii="Avenir Book" w:hAnsi="Avenir Book"/>
+          <w:color w:val="FF0000"/>
+          <w:sz w:val="21"/>
+          <w:szCs w:val="21"/>
+          <w:lang w:val="es-MX"/>
+        </w:rPr>
         <w:t>}}</w:t>
       </w:r>
       <w:r>
@@ -4621,7 +4761,7 @@
           <w:szCs w:val="21"/>
           <w:lang w:val="es-MX"/>
         </w:rPr>
-        <w:t>DIA TERMINO VIGENCIA</w:t>
+        <w:t>DIA</w:t>
       </w:r>
       <w:r>
         <w:rPr>
@@ -4631,6 +4771,46 @@
           <w:szCs w:val="21"/>
           <w:lang w:val="es-MX"/>
         </w:rPr>
+        <w:t>_</w:t>
+      </w:r>
+      <w:r>
+        <w:rPr>
+          <w:rFonts w:ascii="Avenir Book" w:hAnsi="Avenir Book"/>
+          <w:color w:val="FF0000"/>
+          <w:sz w:val="21"/>
+          <w:szCs w:val="21"/>
+          <w:lang w:val="es-MX"/>
+        </w:rPr>
+        <w:t>TERMINO</w:t>
+      </w:r>
+      <w:r>
+        <w:rPr>
+          <w:rFonts w:ascii="Avenir Book" w:hAnsi="Avenir Book"/>
+          <w:color w:val="FF0000"/>
+          <w:sz w:val="21"/>
+          <w:szCs w:val="21"/>
+          <w:lang w:val="es-MX"/>
+        </w:rPr>
+        <w:t>_</w:t>
+      </w:r>
+      <w:r>
+        <w:rPr>
+          <w:rFonts w:ascii="Avenir Book" w:hAnsi="Avenir Book"/>
+          <w:color w:val="FF0000"/>
+          <w:sz w:val="21"/>
+          <w:szCs w:val="21"/>
+          <w:lang w:val="es-MX"/>
+        </w:rPr>
+        <w:t>VIGENCIA</w:t>
+      </w:r>
+      <w:r>
+        <w:rPr>
+          <w:rFonts w:ascii="Avenir Book" w:hAnsi="Avenir Book"/>
+          <w:color w:val="FF0000"/>
+          <w:sz w:val="21"/>
+          <w:szCs w:val="21"/>
+          <w:lang w:val="es-MX"/>
+        </w:rPr>
         <w:t>}}</w:t>
       </w:r>
       <w:r>
@@ -4670,7 +4850,7 @@
           <w:szCs w:val="21"/>
           <w:lang w:val="es-MX"/>
         </w:rPr>
-        <w:t>MES TERMINO VIGENCIA</w:t>
+        <w:t>MES</w:t>
       </w:r>
       <w:r>
         <w:rPr>
@@ -4680,6 +4860,46 @@
           <w:szCs w:val="21"/>
           <w:lang w:val="es-MX"/>
         </w:rPr>
+        <w:t>_</w:t>
+      </w:r>
+      <w:r>
+        <w:rPr>
+          <w:rFonts w:ascii="Avenir Book" w:hAnsi="Avenir Book"/>
+          <w:color w:val="FF0000"/>
+          <w:sz w:val="21"/>
+          <w:szCs w:val="21"/>
+          <w:lang w:val="es-MX"/>
+        </w:rPr>
+        <w:t>TERMINO</w:t>
+      </w:r>
+      <w:r>
+        <w:rPr>
+          <w:rFonts w:ascii="Avenir Book" w:hAnsi="Avenir Book"/>
+          <w:color w:val="FF0000"/>
+          <w:sz w:val="21"/>
+          <w:szCs w:val="21"/>
+          <w:lang w:val="es-MX"/>
+        </w:rPr>
+        <w:t>_</w:t>
+      </w:r>
+      <w:r>
+        <w:rPr>
+          <w:rFonts w:ascii="Avenir Book" w:hAnsi="Avenir Book"/>
+          <w:color w:val="FF0000"/>
+          <w:sz w:val="21"/>
+          <w:szCs w:val="21"/>
+          <w:lang w:val="es-MX"/>
+        </w:rPr>
+        <w:t>VIGENCIA</w:t>
+      </w:r>
+      <w:r>
+        <w:rPr>
+          <w:rFonts w:ascii="Avenir Book" w:hAnsi="Avenir Book"/>
+          <w:color w:val="FF0000"/>
+          <w:sz w:val="21"/>
+          <w:szCs w:val="21"/>
+          <w:lang w:val="es-MX"/>
+        </w:rPr>
         <w:t>}}</w:t>
       </w:r>
       <w:r>
@@ -4709,7 +4929,47 @@
           <w:szCs w:val="21"/>
           <w:lang w:val="es-MX"/>
         </w:rPr>
-        <w:t>AÑO TERMINO VIGENCIA</w:t>
+        <w:t>AÑO</w:t>
+      </w:r>
+      <w:r>
+        <w:rPr>
+          <w:rFonts w:ascii="Avenir Book" w:hAnsi="Avenir Book"/>
+          <w:color w:val="FF0000"/>
+          <w:sz w:val="21"/>
+          <w:szCs w:val="21"/>
+          <w:lang w:val="es-MX"/>
+        </w:rPr>
+        <w:t>_</w:t>
+      </w:r>
+      <w:r>
+        <w:rPr>
+          <w:rFonts w:ascii="Avenir Book" w:hAnsi="Avenir Book"/>
+          <w:color w:val="FF0000"/>
+          <w:sz w:val="21"/>
+          <w:szCs w:val="21"/>
+          <w:lang w:val="es-MX"/>
+        </w:rPr>
+        <w:t>TERMINO</w:t>
+      </w:r>
+      <w:r>
+        <w:rPr>
+          <w:rFonts w:ascii="Avenir Book" w:hAnsi="Avenir Book"/>
+          <w:color w:val="FF0000"/>
+          <w:sz w:val="21"/>
+          <w:szCs w:val="21"/>
+          <w:lang w:val="es-MX"/>
+        </w:rPr>
+        <w:t>_</w:t>
+      </w:r>
+      <w:r>
+        <w:rPr>
+          <w:rFonts w:ascii="Avenir Book" w:hAnsi="Avenir Book"/>
+          <w:color w:val="FF0000"/>
+          <w:sz w:val="21"/>
+          <w:szCs w:val="21"/>
+          <w:lang w:val="es-MX"/>
+        </w:rPr>
+        <w:t>VIGENCIA</w:t>
       </w:r>
       <w:r>
         <w:rPr>

</xml_diff>

<commit_message>
modificacion plantillas contratos fisico y moral
</commit_message>
<xml_diff>
--- a/src/main/resources/templates/docgen/4.1/4.1.-CONTRATO DE PRESTACIÓN DE SERVICIOS (MORAL).docx
+++ b/src/main/resources/templates/docgen/4.1/4.1.-CONTRATO DE PRESTACIÓN DE SERVICIOS (MORAL).docx
@@ -147,12 +147,11 @@
           <w:rFonts w:ascii="Avenir Book" w:hAnsi="Avenir Book"/>
           <w:b/>
           <w:bCs/>
-          <w:color w:val="FF0000"/>
-          <w:sz w:val="21"/>
-          <w:szCs w:val="21"/>
-          <w:lang w:val="es-MX"/>
-        </w:rPr>
-        <w:t>{{EL_PRESTADOR_DE_SERVICIOS}}</w:t>
+          <w:sz w:val="21"/>
+          <w:szCs w:val="21"/>
+          <w:lang w:val="es-MX"/>
+        </w:rPr>
+        <w:t>EL PRESTADOR DE SERVICIOS</w:t>
       </w:r>
       <w:r>
         <w:rPr>

</xml_diff>